<commit_message>
latest gate pass added
</commit_message>
<xml_diff>
--- a/aBility MVP Document.docx
+++ b/aBility MVP Document.docx
@@ -253,13 +253,23 @@
           <w:szCs w:val="24"/>
         </w:rPr>
       </w:pPr>
-      <w:r>
-        <w:rPr>
-          <w:rFonts w:ascii="Bahnschrift Light" w:eastAsia="Times New Roman" w:hAnsi="Bahnschrift Light" w:cs="Times New Roman"/>
-          <w:sz w:val="24"/>
-          <w:szCs w:val="24"/>
-        </w:rPr>
-        <w:t>A. Authentication &amp; Security (Hardened)</w:t>
+      <w:proofErr w:type="spellStart"/>
+      <w:r>
+        <w:rPr>
+          <w:rFonts w:ascii="Bahnschrift Light" w:eastAsia="Times New Roman" w:hAnsi="Bahnschrift Light" w:cs="Times New Roman"/>
+          <w:sz w:val="24"/>
+          <w:szCs w:val="24"/>
+        </w:rPr>
+        <w:t>i</w:t>
+      </w:r>
+      <w:proofErr w:type="spellEnd"/>
+      <w:r>
+        <w:rPr>
+          <w:rFonts w:ascii="Bahnschrift Light" w:eastAsia="Times New Roman" w:hAnsi="Bahnschrift Light" w:cs="Times New Roman"/>
+          <w:sz w:val="24"/>
+          <w:szCs w:val="24"/>
+        </w:rPr>
+        <w:t>. Authentication &amp; Security (Hardened)</w:t>
       </w:r>
     </w:p>
     <w:p>
@@ -325,31 +335,59 @@
           <w:szCs w:val="24"/>
         </w:rPr>
       </w:pPr>
-      <w:r>
-        <w:rPr>
-          <w:rFonts w:ascii="Bahnschrift Light" w:eastAsia="Times New Roman" w:hAnsi="Bahnschrift Light" w:cs="Times New Roman"/>
-          <w:sz w:val="24"/>
-          <w:szCs w:val="24"/>
-        </w:rPr>
-        <w:t>B. Asset &amp; Item Management</w:t>
-      </w:r>
-    </w:p>
-    <w:p>
-      <w:pPr>
-        <w:spacing w:before="100" w:beforeAutospacing="1" w:after="100" w:afterAutospacing="1" w:line="240" w:lineRule="auto"/>
-        <w:rPr>
-          <w:rFonts w:ascii="Bahnschrift Light" w:eastAsia="Times New Roman" w:hAnsi="Bahnschrift Light" w:cs="Times New Roman"/>
-          <w:sz w:val="24"/>
-          <w:szCs w:val="24"/>
-        </w:rPr>
-      </w:pPr>
-      <w:r>
-        <w:rPr>
-          <w:rFonts w:ascii="Bahnschrift Light" w:eastAsia="Times New Roman" w:hAnsi="Bahnschrift Light" w:cs="Times New Roman"/>
-          <w:sz w:val="24"/>
-          <w:szCs w:val="24"/>
-        </w:rPr>
-        <w:t>Centralized Registry: CRUD operations for items, categories, and departments.</w:t>
+      <w:proofErr w:type="gramStart"/>
+      <w:r>
+        <w:rPr>
+          <w:rFonts w:ascii="Bahnschrift Light" w:eastAsia="Times New Roman" w:hAnsi="Bahnschrift Light" w:cs="Times New Roman"/>
+          <w:sz w:val="24"/>
+          <w:szCs w:val="24"/>
+        </w:rPr>
+        <w:t>ii</w:t>
+      </w:r>
+      <w:proofErr w:type="gramEnd"/>
+      <w:r>
+        <w:rPr>
+          <w:rFonts w:ascii="Bahnschrift Light" w:eastAsia="Times New Roman" w:hAnsi="Bahnschrift Light" w:cs="Times New Roman"/>
+          <w:sz w:val="24"/>
+          <w:szCs w:val="24"/>
+        </w:rPr>
+        <w:t xml:space="preserve">. </w:t>
+      </w:r>
+      <w:r>
+        <w:rPr>
+          <w:rFonts w:ascii="Bahnschrift Light" w:eastAsia="Times New Roman" w:hAnsi="Bahnschrift Light" w:cs="Times New Roman"/>
+          <w:sz w:val="24"/>
+          <w:szCs w:val="24"/>
+        </w:rPr>
+        <w:t>Asset &amp; Item Management</w:t>
+      </w:r>
+    </w:p>
+    <w:p>
+      <w:pPr>
+        <w:spacing w:before="100" w:beforeAutospacing="1" w:after="100" w:afterAutospacing="1" w:line="240" w:lineRule="auto"/>
+        <w:rPr>
+          <w:rFonts w:ascii="Bahnschrift Light" w:eastAsia="Times New Roman" w:hAnsi="Bahnschrift Light" w:cs="Times New Roman"/>
+          <w:sz w:val="24"/>
+          <w:szCs w:val="24"/>
+        </w:rPr>
+      </w:pPr>
+      <w:r>
+        <w:rPr>
+          <w:rFonts w:ascii="Bahnschrift Light" w:eastAsia="Times New Roman" w:hAnsi="Bahnschrift Light" w:cs="Times New Roman"/>
+          <w:sz w:val="24"/>
+          <w:szCs w:val="24"/>
+        </w:rPr>
+        <w:t>Centralized Registry: CRUD operations</w:t>
+      </w:r>
+      <w:bookmarkStart w:id="0" w:name="_GoBack"/>
+      <w:bookmarkEnd w:id="0"/>
+      <w:r>
+        <w:rPr>
+          <w:rFonts w:ascii="Bahnschrift Light" w:eastAsia="Times New Roman" w:hAnsi="Bahnschrift Light" w:cs="Times New Roman"/>
+          <w:sz w:val="24"/>
+          <w:szCs w:val="24"/>
+        </w:rPr>
+        <w:t xml:space="preserve"> for items, categories, and departments.</w:t>
       </w:r>
     </w:p>
     <w:p>
@@ -925,8 +963,6 @@
         </w:rPr>
         <w:t xml:space="preserve"> Complete</w:t>
       </w:r>
-      <w:bookmarkStart w:id="0" w:name="_GoBack"/>
-      <w:bookmarkEnd w:id="0"/>
     </w:p>
     <w:p>
       <w:pPr>

</xml_diff>

<commit_message>
Event Source Separation & Automatic Creation
</commit_message>
<xml_diff>
--- a/aBility MVP Document.docx
+++ b/aBility MVP Document.docx
@@ -253,13 +253,23 @@
           <w:szCs w:val="24"/>
         </w:rPr>
       </w:pPr>
-      <w:r>
-        <w:rPr>
-          <w:rFonts w:ascii="Bahnschrift Light" w:eastAsia="Times New Roman" w:hAnsi="Bahnschrift Light" w:cs="Times New Roman"/>
-          <w:sz w:val="24"/>
-          <w:szCs w:val="24"/>
-        </w:rPr>
-        <w:t>A. Authentication &amp; Security (Hardened)</w:t>
+      <w:proofErr w:type="spellStart"/>
+      <w:r>
+        <w:rPr>
+          <w:rFonts w:ascii="Bahnschrift Light" w:eastAsia="Times New Roman" w:hAnsi="Bahnschrift Light" w:cs="Times New Roman"/>
+          <w:sz w:val="24"/>
+          <w:szCs w:val="24"/>
+        </w:rPr>
+        <w:t>i</w:t>
+      </w:r>
+      <w:proofErr w:type="spellEnd"/>
+      <w:r>
+        <w:rPr>
+          <w:rFonts w:ascii="Bahnschrift Light" w:eastAsia="Times New Roman" w:hAnsi="Bahnschrift Light" w:cs="Times New Roman"/>
+          <w:sz w:val="24"/>
+          <w:szCs w:val="24"/>
+        </w:rPr>
+        <w:t>. Authentication &amp; Security (Hardened)</w:t>
       </w:r>
     </w:p>
     <w:p>
@@ -325,31 +335,59 @@
           <w:szCs w:val="24"/>
         </w:rPr>
       </w:pPr>
-      <w:r>
-        <w:rPr>
-          <w:rFonts w:ascii="Bahnschrift Light" w:eastAsia="Times New Roman" w:hAnsi="Bahnschrift Light" w:cs="Times New Roman"/>
-          <w:sz w:val="24"/>
-          <w:szCs w:val="24"/>
-        </w:rPr>
-        <w:t>B. Asset &amp; Item Management</w:t>
-      </w:r>
-    </w:p>
-    <w:p>
-      <w:pPr>
-        <w:spacing w:before="100" w:beforeAutospacing="1" w:after="100" w:afterAutospacing="1" w:line="240" w:lineRule="auto"/>
-        <w:rPr>
-          <w:rFonts w:ascii="Bahnschrift Light" w:eastAsia="Times New Roman" w:hAnsi="Bahnschrift Light" w:cs="Times New Roman"/>
-          <w:sz w:val="24"/>
-          <w:szCs w:val="24"/>
-        </w:rPr>
-      </w:pPr>
-      <w:r>
-        <w:rPr>
-          <w:rFonts w:ascii="Bahnschrift Light" w:eastAsia="Times New Roman" w:hAnsi="Bahnschrift Light" w:cs="Times New Roman"/>
-          <w:sz w:val="24"/>
-          <w:szCs w:val="24"/>
-        </w:rPr>
-        <w:t>Centralized Registry: CRUD operations for items, categories, and departments.</w:t>
+      <w:proofErr w:type="gramStart"/>
+      <w:r>
+        <w:rPr>
+          <w:rFonts w:ascii="Bahnschrift Light" w:eastAsia="Times New Roman" w:hAnsi="Bahnschrift Light" w:cs="Times New Roman"/>
+          <w:sz w:val="24"/>
+          <w:szCs w:val="24"/>
+        </w:rPr>
+        <w:t>ii</w:t>
+      </w:r>
+      <w:proofErr w:type="gramEnd"/>
+      <w:r>
+        <w:rPr>
+          <w:rFonts w:ascii="Bahnschrift Light" w:eastAsia="Times New Roman" w:hAnsi="Bahnschrift Light" w:cs="Times New Roman"/>
+          <w:sz w:val="24"/>
+          <w:szCs w:val="24"/>
+        </w:rPr>
+        <w:t xml:space="preserve">. </w:t>
+      </w:r>
+      <w:r>
+        <w:rPr>
+          <w:rFonts w:ascii="Bahnschrift Light" w:eastAsia="Times New Roman" w:hAnsi="Bahnschrift Light" w:cs="Times New Roman"/>
+          <w:sz w:val="24"/>
+          <w:szCs w:val="24"/>
+        </w:rPr>
+        <w:t>Asset &amp; Item Management</w:t>
+      </w:r>
+    </w:p>
+    <w:p>
+      <w:pPr>
+        <w:spacing w:before="100" w:beforeAutospacing="1" w:after="100" w:afterAutospacing="1" w:line="240" w:lineRule="auto"/>
+        <w:rPr>
+          <w:rFonts w:ascii="Bahnschrift Light" w:eastAsia="Times New Roman" w:hAnsi="Bahnschrift Light" w:cs="Times New Roman"/>
+          <w:sz w:val="24"/>
+          <w:szCs w:val="24"/>
+        </w:rPr>
+      </w:pPr>
+      <w:r>
+        <w:rPr>
+          <w:rFonts w:ascii="Bahnschrift Light" w:eastAsia="Times New Roman" w:hAnsi="Bahnschrift Light" w:cs="Times New Roman"/>
+          <w:sz w:val="24"/>
+          <w:szCs w:val="24"/>
+        </w:rPr>
+        <w:t>Centralized Registry: CRUD operations</w:t>
+      </w:r>
+      <w:bookmarkStart w:id="0" w:name="_GoBack"/>
+      <w:bookmarkEnd w:id="0"/>
+      <w:r>
+        <w:rPr>
+          <w:rFonts w:ascii="Bahnschrift Light" w:eastAsia="Times New Roman" w:hAnsi="Bahnschrift Light" w:cs="Times New Roman"/>
+          <w:sz w:val="24"/>
+          <w:szCs w:val="24"/>
+        </w:rPr>
+        <w:t xml:space="preserve"> for items, categories, and departments.</w:t>
       </w:r>
     </w:p>
     <w:p>
@@ -925,8 +963,6 @@
         </w:rPr>
         <w:t xml:space="preserve"> Complete</w:t>
       </w:r>
-      <w:bookmarkStart w:id="0" w:name="_GoBack"/>
-      <w:bookmarkEnd w:id="0"/>
     </w:p>
     <w:p>
       <w:pPr>

</xml_diff>

<commit_message>
Fix accessory AJAX form submission and add View Assigned Items modal with DataTables
</commit_message>
<xml_diff>
--- a/aBility MVP Document.docx
+++ b/aBility MVP Document.docx
@@ -253,13 +253,23 @@
           <w:szCs w:val="24"/>
         </w:rPr>
       </w:pPr>
-      <w:r>
-        <w:rPr>
-          <w:rFonts w:ascii="Bahnschrift Light" w:eastAsia="Times New Roman" w:hAnsi="Bahnschrift Light" w:cs="Times New Roman"/>
-          <w:sz w:val="24"/>
-          <w:szCs w:val="24"/>
-        </w:rPr>
-        <w:t>A. Authentication &amp; Security (Hardened)</w:t>
+      <w:proofErr w:type="spellStart"/>
+      <w:r>
+        <w:rPr>
+          <w:rFonts w:ascii="Bahnschrift Light" w:eastAsia="Times New Roman" w:hAnsi="Bahnschrift Light" w:cs="Times New Roman"/>
+          <w:sz w:val="24"/>
+          <w:szCs w:val="24"/>
+        </w:rPr>
+        <w:t>i</w:t>
+      </w:r>
+      <w:proofErr w:type="spellEnd"/>
+      <w:r>
+        <w:rPr>
+          <w:rFonts w:ascii="Bahnschrift Light" w:eastAsia="Times New Roman" w:hAnsi="Bahnschrift Light" w:cs="Times New Roman"/>
+          <w:sz w:val="24"/>
+          <w:szCs w:val="24"/>
+        </w:rPr>
+        <w:t>. Authentication &amp; Security (Hardened)</w:t>
       </w:r>
     </w:p>
     <w:p>
@@ -325,31 +335,59 @@
           <w:szCs w:val="24"/>
         </w:rPr>
       </w:pPr>
-      <w:r>
-        <w:rPr>
-          <w:rFonts w:ascii="Bahnschrift Light" w:eastAsia="Times New Roman" w:hAnsi="Bahnschrift Light" w:cs="Times New Roman"/>
-          <w:sz w:val="24"/>
-          <w:szCs w:val="24"/>
-        </w:rPr>
-        <w:t>B. Asset &amp; Item Management</w:t>
-      </w:r>
-    </w:p>
-    <w:p>
-      <w:pPr>
-        <w:spacing w:before="100" w:beforeAutospacing="1" w:after="100" w:afterAutospacing="1" w:line="240" w:lineRule="auto"/>
-        <w:rPr>
-          <w:rFonts w:ascii="Bahnschrift Light" w:eastAsia="Times New Roman" w:hAnsi="Bahnschrift Light" w:cs="Times New Roman"/>
-          <w:sz w:val="24"/>
-          <w:szCs w:val="24"/>
-        </w:rPr>
-      </w:pPr>
-      <w:r>
-        <w:rPr>
-          <w:rFonts w:ascii="Bahnschrift Light" w:eastAsia="Times New Roman" w:hAnsi="Bahnschrift Light" w:cs="Times New Roman"/>
-          <w:sz w:val="24"/>
-          <w:szCs w:val="24"/>
-        </w:rPr>
-        <w:t>Centralized Registry: CRUD operations for items, categories, and departments.</w:t>
+      <w:proofErr w:type="gramStart"/>
+      <w:r>
+        <w:rPr>
+          <w:rFonts w:ascii="Bahnschrift Light" w:eastAsia="Times New Roman" w:hAnsi="Bahnschrift Light" w:cs="Times New Roman"/>
+          <w:sz w:val="24"/>
+          <w:szCs w:val="24"/>
+        </w:rPr>
+        <w:t>ii</w:t>
+      </w:r>
+      <w:proofErr w:type="gramEnd"/>
+      <w:r>
+        <w:rPr>
+          <w:rFonts w:ascii="Bahnschrift Light" w:eastAsia="Times New Roman" w:hAnsi="Bahnschrift Light" w:cs="Times New Roman"/>
+          <w:sz w:val="24"/>
+          <w:szCs w:val="24"/>
+        </w:rPr>
+        <w:t xml:space="preserve">. </w:t>
+      </w:r>
+      <w:r>
+        <w:rPr>
+          <w:rFonts w:ascii="Bahnschrift Light" w:eastAsia="Times New Roman" w:hAnsi="Bahnschrift Light" w:cs="Times New Roman"/>
+          <w:sz w:val="24"/>
+          <w:szCs w:val="24"/>
+        </w:rPr>
+        <w:t>Asset &amp; Item Management</w:t>
+      </w:r>
+    </w:p>
+    <w:p>
+      <w:pPr>
+        <w:spacing w:before="100" w:beforeAutospacing="1" w:after="100" w:afterAutospacing="1" w:line="240" w:lineRule="auto"/>
+        <w:rPr>
+          <w:rFonts w:ascii="Bahnschrift Light" w:eastAsia="Times New Roman" w:hAnsi="Bahnschrift Light" w:cs="Times New Roman"/>
+          <w:sz w:val="24"/>
+          <w:szCs w:val="24"/>
+        </w:rPr>
+      </w:pPr>
+      <w:r>
+        <w:rPr>
+          <w:rFonts w:ascii="Bahnschrift Light" w:eastAsia="Times New Roman" w:hAnsi="Bahnschrift Light" w:cs="Times New Roman"/>
+          <w:sz w:val="24"/>
+          <w:szCs w:val="24"/>
+        </w:rPr>
+        <w:t>Centralized Registry: CRUD operations</w:t>
+      </w:r>
+      <w:bookmarkStart w:id="0" w:name="_GoBack"/>
+      <w:bookmarkEnd w:id="0"/>
+      <w:r>
+        <w:rPr>
+          <w:rFonts w:ascii="Bahnschrift Light" w:eastAsia="Times New Roman" w:hAnsi="Bahnschrift Light" w:cs="Times New Roman"/>
+          <w:sz w:val="24"/>
+          <w:szCs w:val="24"/>
+        </w:rPr>
+        <w:t xml:space="preserve"> for items, categories, and departments.</w:t>
       </w:r>
     </w:p>
     <w:p>
@@ -925,8 +963,6 @@
         </w:rPr>
         <w:t xml:space="preserve"> Complete</w:t>
       </w:r>
-      <w:bookmarkStart w:id="0" w:name="_GoBack"/>
-      <w:bookmarkEnd w:id="0"/>
     </w:p>
     <w:p>
       <w:pPr>

</xml_diff>